<commit_message>
Four small calls from proof pass 2 (D107): titles in one form, an invented hospital name, the nacho card heading, the frosting budget
Every handout, slide outline and assessment title now reads the way the lessons do (Handout 4.11, not Handout 04.11); the fictional source on the food video handout is Harbor Point Community Hospital; the nacho station card no longer promises Spanish steps that are not written; the Unit 4 budget follows Lesson 4.8 (one gel set per station).

Co-Authored-By: Claude Fable 5.1 <noreply@anthropic.com>
Claude-Session: https://claude.ai/code/session_01TaQLEJCtq2ruLJPqxdFc8k
</commit_message>
<xml_diff>
--- a/downloads/documents/04 Units/Unit 04 - Environmental Design and Management - Spaces We Live In/Unit 04 - Environmental Design and Management - Spaces We Live In.docx
+++ b/downloads/documents/04 Units/Unit 04 - Environmental Design and Management - Spaces We Live In/Unit 04 - Environmental Design and Management - Spaces We Live In.docx
@@ -5689,18 +5689,18 @@
               <w:jc w:val="left"/>
             </w:pPr>
             <w:r>
-              <w:t xml:space="preserve">one 16-ounce tub of white frosting per station for three stations (each station serves two tables of four), one set of red, yellow, and blue food gel colors shared by the room, paper plates (two per student: a mixing plate and a wall panel), parchment squares, a box of wipes, plastic knives or craft sticks</w:t>
-            </w:r>
-          </w:p>
-        </w:tc>
-        <w:tc>
-          <w:p>
-            <w:pPr>
-              <w:pStyle w:val="Compact"/>
-              <w:jc w:val="left"/>
-            </w:pPr>
-            <w:r>
-              <w:t xml:space="preserve">about $12 per class</w:t>
+              <w:t xml:space="preserve">one 16-ounce tub of white frosting per station for three stations (each station serves two tables of four), one set of red, yellow, and blue food gel colors per station plus one for the demo tub, so nobody crosses the room with frosting on their hands, paper plates (two per student: a mixing plate and a wall panel), parchment squares, a box of wipes, plastic knives or craft sticks</w:t>
+            </w:r>
+          </w:p>
+        </w:tc>
+        <w:tc>
+          <w:p>
+            <w:pPr>
+              <w:pStyle w:val="Compact"/>
+              <w:jc w:val="left"/>
+            </w:pPr>
+            <w:r>
+              <w:t xml:space="preserve">about $32 to $36 per class (Lesson 4.8’s list)</w:t>
             </w:r>
           </w:p>
         </w:tc>
@@ -6598,7 +6598,7 @@
         <w:pStyle w:val="BodyText"/>
       </w:pPr>
       <w:r>
-        <w:t xml:space="preserve">Unit total for one section: about $90 in consumables the first year if the custodian lends the tools and the detectors and the science department lends the watt meter, as the lessons suggest (frosting $12, model materials about $45, graph paper and card stock about $20, photos and posters about $10, station screws and props about $10); up to about $200 if the tool tray, the detectors, and the watt meter are all bought new. About $55 after the first year (the frosting and the model materials are the two lines that repeat every section).</w:t>
+        <w:t xml:space="preserve">Unit total for one section: about $115 in consumables the first year if the custodian lends the tools and the detectors and the science department lends the watt meter, as the lessons suggest (frosting about $34, model materials about $45, graph paper and card stock about $20, photos and posters about $10, station screws and props about $10); up to about $200 if the tool tray, the detectors, and the watt meter are all bought new. About $80 after the first year (the frosting and the model materials are the two lines that repeat every section).</w:t>
       </w:r>
     </w:p>
     <w:p>

</xml_diff>